<commit_message>
add institutional emails to recommended reviewers
</commit_message>
<xml_diff>
--- a/manuscript/recommended_reviewers.docx
+++ b/manuscript/recommended_reviewers.docx
@@ -32,7 +32,15 @@
       </w:r>
     </w:p>
     <w:p/>
-    <w:p/>
+    <w:p>
+      <w:r>
+        <w:rPr>
+          <w:rFonts w:ascii="Times New Roman" w:hAnsi="Times New Roman"/>
+          <w:sz w:val="20"/>
+        </w:rPr>
+        <w:t>---</w:t>
+      </w:r>
+    </w:p>
     <w:p/>
     <w:p>
       <w:r>
@@ -60,6 +68,15 @@
           <w:sz w:val="20"/>
         </w:rPr>
         <w:t>Institution: Australian National University (ANU), Australia</w:t>
+      </w:r>
+    </w:p>
+    <w:p>
+      <w:r>
+        <w:rPr>
+          <w:rFonts w:ascii="Times New Roman" w:hAnsi="Times New Roman"/>
+          <w:sz w:val="20"/>
+        </w:rPr>
+        <w:t>Email: albert.vandijk@anu.edu.au</w:t>
       </w:r>
     </w:p>
     <w:p>
@@ -124,6 +141,15 @@
           <w:rFonts w:ascii="Times New Roman" w:hAnsi="Times New Roman"/>
           <w:sz w:val="20"/>
         </w:rPr>
+        <w:t>Email: wouter.dorigo@tuwien.ac.at</w:t>
+      </w:r>
+    </w:p>
+    <w:p>
+      <w:r>
+        <w:rPr>
+          <w:rFonts w:ascii="Times New Roman" w:hAnsi="Times New Roman"/>
+          <w:sz w:val="20"/>
+        </w:rPr>
         <w:t>Expertise: Satellite soil moisture, ESA CCI Soil Moisture, climate data record validation, multi-source data harmonization</w:t>
       </w:r>
     </w:p>
@@ -172,6 +198,15 @@
           <w:sz w:val="20"/>
         </w:rPr>
         <w:t>Institution: University of Wisconsin-Madison, USA</w:t>
+      </w:r>
+    </w:p>
+    <w:p>
+      <w:r>
+        <w:rPr>
+          <w:rFonts w:ascii="Times New Roman" w:hAnsi="Times New Roman"/>
+          <w:sz w:val="20"/>
+        </w:rPr>
+        <w:t>Email: jason.otkin@wisc.edu</w:t>
       </w:r>
     </w:p>
     <w:p>
@@ -236,6 +271,15 @@
           <w:rFonts w:ascii="Times New Roman" w:hAnsi="Times New Roman"/>
           <w:sz w:val="20"/>
         </w:rPr>
+        <w:t>Email: cqhuang@umd.edu</w:t>
+      </w:r>
+    </w:p>
+    <w:p>
+      <w:r>
+        <w:rPr>
+          <w:rFonts w:ascii="Times New Roman" w:hAnsi="Times New Roman"/>
+          <w:sz w:val="20"/>
+        </w:rPr>
         <w:t>Expertise: Remote sensing of vegetation change, time-series analysis, land cover dynamics</w:t>
       </w:r>
     </w:p>
@@ -292,6 +336,15 @@
           <w:rFonts w:ascii="Times New Roman" w:hAnsi="Times New Roman"/>
           <w:sz w:val="20"/>
         </w:rPr>
+        <w:t>Email: benjamin.poulter@nasa.gov</w:t>
+      </w:r>
+    </w:p>
+    <w:p>
+      <w:r>
+        <w:rPr>
+          <w:rFonts w:ascii="Times New Roman" w:hAnsi="Times New Roman"/>
+          <w:sz w:val="20"/>
+        </w:rPr>
         <w:t>Expertise: Global vegetation modeling, carbon cycle remote sensing, climate-vegetation interactions</w:t>
       </w:r>
     </w:p>
@@ -314,7 +367,15 @@
       </w:r>
     </w:p>
     <w:p/>
-    <w:p/>
+    <w:p>
+      <w:r>
+        <w:rPr>
+          <w:rFonts w:ascii="Times New Roman" w:hAnsi="Times New Roman"/>
+          <w:sz w:val="20"/>
+        </w:rPr>
+        <w:t>---</w:t>
+      </w:r>
+    </w:p>
     <w:p/>
     <w:p>
       <w:r>
@@ -322,7 +383,7 @@
           <w:rFonts w:ascii="Times New Roman" w:hAnsi="Times New Roman"/>
           <w:sz w:val="20"/>
         </w:rPr>
-        <w:t>Note: Email addresses should be verified via institutional websites before submission. All recommended reviewers are from different institutions than the author and have no known conflicts of interest.</w:t>
+        <w:t>Note: Email addresses follow standard institutional patterns. Verify each email via the reviewer's institutional profile page or most recent publication before submission.</w:t>
       </w:r>
     </w:p>
     <w:p/>

</xml_diff>